<commit_message>
final manuscript shared with the team
</commit_message>
<xml_diff>
--- a/Mortgage_Manuscrip_UJ.docx
+++ b/Mortgage_Manuscrip_UJ.docx
@@ -2087,27 +2087,14 @@
       <w:r>
         <w:t xml:space="preserve">Table </w:t>
       </w:r>
-      <w:r>
-        <w:fldChar w:fldCharType="begin"/>
-      </w:r>
-      <w:r>
-        <w:instrText xml:space="preserve"> SEQ Table \* ARABIC </w:instrText>
-      </w:r>
-      <w:r>
-        <w:fldChar w:fldCharType="separate"/>
-      </w:r>
-      <w:r>
-        <w:rPr>
-          <w:noProof/>
-        </w:rPr>
-        <w:t>1</w:t>
-      </w:r>
-      <w:r>
-        <w:rPr>
-          <w:noProof/>
-        </w:rPr>
-        <w:fldChar w:fldCharType="end"/>
-      </w:r>
+      <w:fldSimple w:instr=" SEQ Table \* ARABIC ">
+        <w:r>
+          <w:rPr>
+            <w:noProof/>
+          </w:rPr>
+          <w:t>1</w:t>
+        </w:r>
+      </w:fldSimple>
       <w:r>
         <w:t>:</w:t>
       </w:r>
@@ -8575,27 +8562,14 @@
                             <w:r>
                               <w:t xml:space="preserve">Figure </w:t>
                             </w:r>
-                            <w:r>
-                              <w:fldChar w:fldCharType="begin"/>
-                            </w:r>
-                            <w:r>
-                              <w:instrText xml:space="preserve"> SEQ Figure \* ARABIC </w:instrText>
-                            </w:r>
-                            <w:r>
-                              <w:fldChar w:fldCharType="separate"/>
-                            </w:r>
-                            <w:r>
-                              <w:rPr>
-                                <w:noProof/>
-                              </w:rPr>
-                              <w:t>1</w:t>
-                            </w:r>
-                            <w:r>
-                              <w:rPr>
-                                <w:noProof/>
-                              </w:rPr>
-                              <w:fldChar w:fldCharType="end"/>
-                            </w:r>
+                            <w:fldSimple w:instr=" SEQ Figure \* ARABIC ">
+                              <w:r>
+                                <w:rPr>
+                                  <w:noProof/>
+                                </w:rPr>
+                                <w:t>1</w:t>
+                              </w:r>
+                            </w:fldSimple>
                             <w:r>
                               <w:t>: Denial Rate by County and Yea</w:t>
                             </w:r>
@@ -8751,27 +8725,14 @@
       <w:r>
         <w:t xml:space="preserve">Table </w:t>
       </w:r>
-      <w:r>
-        <w:fldChar w:fldCharType="begin"/>
-      </w:r>
-      <w:r>
-        <w:instrText xml:space="preserve"> SEQ Table \* ARABIC </w:instrText>
-      </w:r>
-      <w:r>
-        <w:fldChar w:fldCharType="separate"/>
-      </w:r>
-      <w:r>
-        <w:rPr>
-          <w:noProof/>
-        </w:rPr>
-        <w:t>2</w:t>
-      </w:r>
-      <w:r>
-        <w:rPr>
-          <w:noProof/>
-        </w:rPr>
-        <w:fldChar w:fldCharType="end"/>
-      </w:r>
+      <w:fldSimple w:instr=" SEQ Table \* ARABIC ">
+        <w:r>
+          <w:rPr>
+            <w:noProof/>
+          </w:rPr>
+          <w:t>2</w:t>
+        </w:r>
+      </w:fldSimple>
       <w:r>
         <w:t xml:space="preserve">: </w:t>
       </w:r>
@@ -13227,27 +13188,14 @@
       <w:r>
         <w:t xml:space="preserve">Figure </w:t>
       </w:r>
-      <w:r>
-        <w:fldChar w:fldCharType="begin"/>
-      </w:r>
-      <w:r>
-        <w:instrText xml:space="preserve"> SEQ Figure \* ARABIC </w:instrText>
-      </w:r>
-      <w:r>
-        <w:fldChar w:fldCharType="separate"/>
-      </w:r>
-      <w:r>
-        <w:rPr>
-          <w:noProof/>
-        </w:rPr>
-        <w:t>2</w:t>
-      </w:r>
-      <w:r>
-        <w:rPr>
-          <w:noProof/>
-        </w:rPr>
-        <w:fldChar w:fldCharType="end"/>
-      </w:r>
+      <w:fldSimple w:instr=" SEQ Figure \* ARABIC ">
+        <w:r>
+          <w:rPr>
+            <w:noProof/>
+          </w:rPr>
+          <w:t>2</w:t>
+        </w:r>
+      </w:fldSimple>
       <w:r>
         <w:t xml:space="preserve">: </w:t>
       </w:r>
@@ -13640,27 +13588,14 @@
       <w:r>
         <w:t xml:space="preserve">Table </w:t>
       </w:r>
-      <w:r>
-        <w:fldChar w:fldCharType="begin"/>
-      </w:r>
-      <w:r>
-        <w:instrText xml:space="preserve"> SEQ Table \* ARABIC </w:instrText>
-      </w:r>
-      <w:r>
-        <w:fldChar w:fldCharType="separate"/>
-      </w:r>
-      <w:r>
-        <w:rPr>
-          <w:noProof/>
-        </w:rPr>
-        <w:t>3</w:t>
-      </w:r>
-      <w:r>
-        <w:rPr>
-          <w:noProof/>
-        </w:rPr>
-        <w:fldChar w:fldCharType="end"/>
-      </w:r>
+      <w:fldSimple w:instr=" SEQ Table \* ARABIC ">
+        <w:r>
+          <w:rPr>
+            <w:noProof/>
+          </w:rPr>
+          <w:t>3</w:t>
+        </w:r>
+      </w:fldSimple>
       <w:r>
         <w:t>: Logistic Regressions (2018 – 2023)</w:t>
       </w:r>
@@ -22848,27 +22783,14 @@
       <w:r>
         <w:t xml:space="preserve">Figure </w:t>
       </w:r>
-      <w:r>
-        <w:fldChar w:fldCharType="begin"/>
-      </w:r>
-      <w:r>
-        <w:instrText xml:space="preserve"> SEQ Figure \* ARABIC </w:instrText>
-      </w:r>
-      <w:r>
-        <w:fldChar w:fldCharType="separate"/>
-      </w:r>
-      <w:r>
-        <w:rPr>
-          <w:noProof/>
-        </w:rPr>
-        <w:t>3</w:t>
-      </w:r>
-      <w:r>
-        <w:rPr>
-          <w:noProof/>
-        </w:rPr>
-        <w:fldChar w:fldCharType="end"/>
-      </w:r>
+      <w:fldSimple w:instr=" SEQ Figure \* ARABIC ">
+        <w:r>
+          <w:rPr>
+            <w:noProof/>
+          </w:rPr>
+          <w:t>3</w:t>
+        </w:r>
+      </w:fldSimple>
       <w:r>
         <w:t>:</w:t>
       </w:r>
@@ -23102,27 +23024,14 @@
       <w:r>
         <w:t xml:space="preserve">Figure </w:t>
       </w:r>
-      <w:r>
-        <w:fldChar w:fldCharType="begin"/>
-      </w:r>
-      <w:r>
-        <w:instrText xml:space="preserve"> SEQ Figure \* ARABIC </w:instrText>
-      </w:r>
-      <w:r>
-        <w:fldChar w:fldCharType="separate"/>
-      </w:r>
-      <w:r>
-        <w:rPr>
-          <w:noProof/>
-        </w:rPr>
-        <w:t>4</w:t>
-      </w:r>
-      <w:r>
-        <w:rPr>
-          <w:noProof/>
-        </w:rPr>
-        <w:fldChar w:fldCharType="end"/>
-      </w:r>
+      <w:fldSimple w:instr=" SEQ Figure \* ARABIC ">
+        <w:r>
+          <w:rPr>
+            <w:noProof/>
+          </w:rPr>
+          <w:t>4</w:t>
+        </w:r>
+      </w:fldSimple>
       <w:r>
         <w:t>:</w:t>
       </w:r>
@@ -23385,24 +23294,14 @@
       <w:r>
         <w:t xml:space="preserve">Figure </w:t>
       </w:r>
-      <w:r>
-        <w:fldChar w:fldCharType="begin"/>
-      </w:r>
-      <w:r>
-        <w:instrText xml:space="preserve"> SEQ Figure \* ARABIC </w:instrText>
-      </w:r>
-      <w:r>
-        <w:fldChar w:fldCharType="separate"/>
-      </w:r>
-      <w:r>
-        <w:rPr>
-          <w:noProof/>
-        </w:rPr>
-        <w:t>5</w:t>
-      </w:r>
-      <w:r>
-        <w:fldChar w:fldCharType="end"/>
-      </w:r>
+      <w:fldSimple w:instr=" SEQ Figure \* ARABIC ">
+        <w:r>
+          <w:rPr>
+            <w:noProof/>
+          </w:rPr>
+          <w:t>5</w:t>
+        </w:r>
+      </w:fldSimple>
       <w:r>
         <w:t>: Trends in county profiles before and after adjusting for the risk factors.</w:t>
       </w:r>
@@ -28955,6 +28854,7 @@
   <w:style w:type="character" w:default="1" w:styleId="DefaultParagraphFont">
     <w:name w:val="Default Paragraph Font"/>
     <w:uiPriority w:val="1"/>
+    <w:semiHidden/>
     <w:unhideWhenUsed/>
   </w:style>
   <w:style w:type="table" w:default="1" w:styleId="TableNormal">

</xml_diff>